<commit_message>
Complete regolamento: participation, phases, and calendar articles
Fills in Art. 5 (Modalità di partecipazione), Art. 6 (Fasi del
contest) and Art. 7 (Calendario e date), matching the app's actual
schedule and rules — candidature deadline 16 settembre 2026, 00:00.
</commit_message>
<xml_diff>
--- a/public/regolamento-contest-fotografico.docx
+++ b/public/regolamento-contest-fotografico.docx
@@ -530,7 +530,72 @@
           <w:sz w:val="22"/>
           <w:szCs w:val="22"/>
         </w:rPr>
-        <w:t xml:space="preserve">.....</w:t>
+        <w:t xml:space="preserve">La partecipazione al Contest avviene esclusivamente tramite il sito ufficiale ComUnità, compilando l’apposito modulo di candidatura online.</w:t>
+      </w:r>
+    </w:p>
+    <w:p>
+      <w:pPr>
+        <w:spacing w:after="160" w:line="300"/>
+      </w:pPr>
+      <w:r>
+        <w:rPr>
+          <w:color w:val="444444"/>
+          <w:sz w:val="22"/>
+          <w:szCs w:val="22"/>
+        </w:rPr>
+        <w:t xml:space="preserve">Per candidarsi è necessario fornire: nome, cognome, indirizzo email, numero di cellulare e luogo di residenza. È possibile presentare una sola candidatura per ciascun indirizzo email.</w:t>
+      </w:r>
+    </w:p>
+    <w:p>
+      <w:pPr>
+        <w:spacing w:after="160" w:line="300"/>
+      </w:pPr>
+      <w:r>
+        <w:rPr>
+          <w:color w:val="444444"/>
+          <w:sz w:val="22"/>
+          <w:szCs w:val="22"/>
+        </w:rPr>
+        <w:t xml:space="preserve">La candidatura si perfeziona con la presa visione dell’informativa sul trattamento dei dati personali e con l’accettazione integrale del presente regolamento, espresse mediante apposite dichiarazioni da rendere in fase di invio.</w:t>
+      </w:r>
+    </w:p>
+    <w:p>
+      <w:pPr>
+        <w:spacing w:after="160" w:line="300"/>
+      </w:pPr>
+      <w:r>
+        <w:rPr>
+          <w:color w:val="444444"/>
+          <w:sz w:val="22"/>
+          <w:szCs w:val="22"/>
+        </w:rPr>
+        <w:t xml:space="preserve">Il partecipante sceglie liberamente a quali dei temi proposti candidarsi — Sanità, Urbanistica, Agricoltura, Rigenerazione Urbana, Sport, Lavoro — potendo aderire a uno, più o tutti i temi. Per ciascun tema è possibile caricare fino a un massimo di due fotografie, ognuna corredata da una breve descrizione (luogo, data, significato dello scatto) e nel rispetto dei requisiti tecnici di cui all’Art. 3.</w:t>
+      </w:r>
+    </w:p>
+    <w:p>
+      <w:pPr>
+        <w:spacing w:after="160" w:line="300"/>
+      </w:pPr>
+      <w:r>
+        <w:rPr>
+          <w:color w:val="444444"/>
+          <w:sz w:val="22"/>
+          <w:szCs w:val="22"/>
+        </w:rPr>
+        <w:t xml:space="preserve">Tutte le fotografie ricevute sono sottoposte a verifica da parte dell’organizzazione prima della pubblicazione nella galleria del Contest: gli scatti non conformi al presente regolamento o ai requisiti tecnici possono essere esclusi, senza che ciò dia diritto ad alcuna forma di indennizzo.</w:t>
+      </w:r>
+    </w:p>
+    <w:p>
+      <w:pPr>
+        <w:spacing w:after="160" w:line="300"/>
+      </w:pPr>
+      <w:r>
+        <w:rPr>
+          <w:color w:val="444444"/>
+          <w:sz w:val="22"/>
+          <w:szCs w:val="22"/>
+        </w:rPr>
+        <w:t xml:space="preserve">Le candidature sono aperte a partire dalla data di pubblicazione del presente regolamento e fino al 16 settembre 2026, ore 00:00, oltre il quale non sarà più possibile inviare nuove fotografie.</w:t>
       </w:r>
     </w:p>
     <w:p>
@@ -581,7 +646,20 @@
           <w:sz w:val="22"/>
           <w:szCs w:val="22"/>
         </w:rPr>
-        <w:t xml:space="preserve">Invio ....</w:t>
+        <w:t xml:space="preserve">Candidature</w:t>
+      </w:r>
+    </w:p>
+    <w:p>
+      <w:pPr>
+        <w:spacing w:after="160" w:line="300"/>
+      </w:pPr>
+      <w:r>
+        <w:rPr>
+          <w:color w:val="444444"/>
+          <w:sz w:val="22"/>
+          <w:szCs w:val="22"/>
+        </w:rPr>
+        <w:t xml:space="preserve">Nel periodo di apertura delle iscrizioni, i partecipanti inviano le proprie fotografie tramite il sito secondo le modalità descritte all’Art. 5.</w:t>
       </w:r>
     </w:p>
     <w:p>
@@ -604,7 +682,59 @@
           <w:sz w:val="22"/>
           <w:szCs w:val="22"/>
         </w:rPr>
-        <w:t xml:space="preserve"> Votazione</w:t>
+        <w:t xml:space="preserve">Votazione</w:t>
+      </w:r>
+    </w:p>
+    <w:p>
+      <w:pPr>
+        <w:spacing w:after="160" w:line="300"/>
+      </w:pPr>
+      <w:r>
+        <w:rPr>
+          <w:color w:val="444444"/>
+          <w:sz w:val="22"/>
+          <w:szCs w:val="22"/>
+        </w:rPr>
+        <w:t xml:space="preserve">La votazione si svolge in forma combinata, online e in presenza:</w:t>
+      </w:r>
+    </w:p>
+    <w:p>
+      <w:pPr>
+        <w:spacing w:after="160" w:line="300"/>
+      </w:pPr>
+      <w:r>
+        <w:rPr>
+          <w:color w:val="444444"/>
+          <w:sz w:val="22"/>
+          <w:szCs w:val="22"/>
+        </w:rPr>
+        <w:t xml:space="preserve">•  Online, dal 17 al 20 settembre 2026: chiunque può votare le fotografie ammesse attraverso il sito, esprimendo un voto per ciascuna fotografia tramite il proprio indirizzo email, senza necessità di registrazione.</w:t>
+      </w:r>
+    </w:p>
+    <w:p>
+      <w:pPr>
+        <w:spacing w:after="160" w:line="300"/>
+      </w:pPr>
+      <w:r>
+        <w:rPr>
+          <w:color w:val="444444"/>
+          <w:sz w:val="22"/>
+          <w:szCs w:val="22"/>
+        </w:rPr>
+        <w:t xml:space="preserve">•  In presenza, dal 18 al 20 settembre 2026: le fotografie ammesse vengono stampate ed esposte a Piazza Duomo (Melfi) nell’ambito della Festa dell’Unità Comunità, dove il pubblico può esprimere il proprio voto anche di persona.</w:t>
+      </w:r>
+    </w:p>
+    <w:p>
+      <w:pPr>
+        <w:spacing w:after="160" w:line="300"/>
+      </w:pPr>
+      <w:r>
+        <w:rPr>
+          <w:color w:val="444444"/>
+          <w:sz w:val="22"/>
+          <w:szCs w:val="22"/>
+        </w:rPr>
+        <w:t xml:space="preserve">I voti raccolti online e quelli raccolti in piazza vengono sommati per determinare la classifica finale di ciascun tema.</w:t>
       </w:r>
     </w:p>
     <w:p>
@@ -627,7 +757,20 @@
           <w:sz w:val="22"/>
           <w:szCs w:val="22"/>
         </w:rPr>
-        <w:t xml:space="preserve">Serata di premiazione</w:t>
+        <w:t xml:space="preserve">Proclamazione dei vincitori</w:t>
+      </w:r>
+    </w:p>
+    <w:p>
+      <w:pPr>
+        <w:spacing w:after="160" w:line="300"/>
+      </w:pPr>
+      <w:r>
+        <w:rPr>
+          <w:color w:val="444444"/>
+          <w:sz w:val="22"/>
+          <w:szCs w:val="22"/>
+        </w:rPr>
+        <w:t xml:space="preserve">I vincitori di tutti i temi sono proclamati il 20 settembre 2026 presso Piazza Duomo (Melfi).</w:t>
       </w:r>
     </w:p>
     <w:p>
@@ -668,7 +811,85 @@
           <w:sz w:val="22"/>
           <w:szCs w:val="22"/>
         </w:rPr>
-        <w:t xml:space="preserve"/>
+        <w:t xml:space="preserve">Di seguito il calendario riepilogativo delle fasi del Contest:</w:t>
+      </w:r>
+    </w:p>
+    <w:p>
+      <w:pPr>
+        <w:spacing w:after="160" w:line="300"/>
+      </w:pPr>
+      <w:r>
+        <w:rPr>
+          <w:color w:val="444444"/>
+          <w:sz w:val="22"/>
+          <w:szCs w:val="22"/>
+        </w:rPr>
+        <w:t xml:space="preserve">•  Candidature: aperte dalla pubblicazione del presente regolamento fino al 16 settembre 2026, ore 00:00.</w:t>
+      </w:r>
+    </w:p>
+    <w:p>
+      <w:pPr>
+        <w:spacing w:after="160" w:line="300"/>
+      </w:pPr>
+      <w:r>
+        <w:rPr>
+          <w:color w:val="444444"/>
+          <w:sz w:val="22"/>
+          <w:szCs w:val="22"/>
+        </w:rPr>
+        <w:t xml:space="preserve">•  17 settembre 2026: apertura della votazione online.</w:t>
+      </w:r>
+    </w:p>
+    <w:p>
+      <w:pPr>
+        <w:spacing w:after="160" w:line="300"/>
+      </w:pPr>
+      <w:r>
+        <w:rPr>
+          <w:color w:val="444444"/>
+          <w:sz w:val="22"/>
+          <w:szCs w:val="22"/>
+        </w:rPr>
+        <w:t xml:space="preserve">•  18 settembre 2026: apertura della votazione in presenza a Piazza Duomo (Melfi), in concomitanza con l’avvio della Festa dell’Unità Comunità.</w:t>
+      </w:r>
+    </w:p>
+    <w:p>
+      <w:pPr>
+        <w:spacing w:after="160" w:line="300"/>
+      </w:pPr>
+      <w:r>
+        <w:rPr>
+          <w:color w:val="444444"/>
+          <w:sz w:val="22"/>
+          <w:szCs w:val="22"/>
+        </w:rPr>
+        <w:t xml:space="preserve">•  18-20 settembre 2026: esposizione delle fotografie ammesse a Piazza Duomo (Melfi).</w:t>
+      </w:r>
+    </w:p>
+    <w:p>
+      <w:pPr>
+        <w:spacing w:after="160" w:line="300"/>
+      </w:pPr>
+      <w:r>
+        <w:rPr>
+          <w:color w:val="444444"/>
+          <w:sz w:val="22"/>
+          <w:szCs w:val="22"/>
+        </w:rPr>
+        <w:t xml:space="preserve">•  20 settembre 2026: chiusura delle votazioni (online e in presenza) e proclamazione dei vincitori presso Piazza Duomo (Melfi).</w:t>
+      </w:r>
+    </w:p>
+    <w:p>
+      <w:pPr>
+        <w:spacing w:after="160" w:line="300"/>
+      </w:pPr>
+      <w:r>
+        <w:rPr>
+          <w:color w:val="444444"/>
+          <w:sz w:val="22"/>
+          <w:szCs w:val="22"/>
+        </w:rPr>
+        <w:t xml:space="preserve">L’organizzazione si riserva la facoltà di modificare le date sopra indicate qualora si rendesse necessario, dandone tempestiva comunicazione sul sito ufficiale del Contest.</w:t>
       </w:r>
     </w:p>
     <w:p>

</xml_diff>